<commit_message>
spec: Plan+Budget accordion build spec + Vendor Taxonomy Shrink doc + 0043→0052 native apps rename
- Vendors_Plan_Budget_Tab_Spec_2026-05-31 (.md/.docx) — 13-section build spec
- Plan_Budget_Accordion_2026-05-31.html — interaction reference mock
- Vendor_Taxonomy_Shrink_2026-05-30 (.md/.docx) — 10-folder/53-tile design lock
- 0052_native_apps_delivery (renamed from 0043; 0043 = Wedding Type Picker)
- Known_Todos_Pre_Pilot.md
- CLAUDE.md + v2.1 brief decision-log updates
- .gitignore: exclude .claude/ + stray remove-time-of-day-greeting/ worktree

Co-Authored-By: Claude Opus 4.8 <noreply@anthropic.com>
</commit_message>
<xml_diff>
--- a/02_Specifications/Vendor_Taxonomy_V1_Master.docx
+++ b/02_Specifications/Vendor_Taxonomy_V1_Master.docx
@@ -2,7 +2,7 @@
 <file path=word/document.xml><?xml version="1.0" encoding="utf-8"?>
 <w:document xmlns:w="http://schemas.openxmlformats.org/wordprocessingml/2006/main" xmlns:m="http://schemas.openxmlformats.org/officeDocument/2006/math" xmlns:r="http://schemas.openxmlformats.org/officeDocument/2006/relationships" xmlns:o="urn:schemas-microsoft-com:office:office" xmlns:v="urn:schemas-microsoft-com:vml" xmlns:w10="urn:schemas-microsoft-com:office:word" xmlns:a="http://schemas.openxmlformats.org/drawingml/2006/main" xmlns:pic="http://schemas.openxmlformats.org/drawingml/2006/picture" xmlns:wp="http://schemas.openxmlformats.org/drawingml/2006/wordprocessingDrawing">
   <w:body>
-    <w:bookmarkStart w:id="60" w:name="Xba1c81fab220e31fc2ae9803f9c2199097f480c"/>
+    <w:bookmarkStart w:id="61" w:name="Xba1c81fab220e31fc2ae9803f9c2199097f480c"/>
     <w:p>
       <w:pPr>
         <w:pStyle w:val="Heading1"/>
@@ -49,13 +49,144 @@
     </w:p>
     <w:p>
       <w:pPr>
-        <w:pStyle w:val="BodyText"/>
+        <w:pStyle w:val="BlockText"/>
       </w:pPr>
       <w:r>
         <w:rPr>
           <w:b/>
           <w:bCs/>
         </w:rPr>
+        <w:t xml:space="preserve">⚠️ SUPERSEDED (visible structure) — shipped to production 2026-05-31.</w:t>
+      </w:r>
+      <w:r>
+        <w:t xml:space="preserve"> </w:t>
+      </w:r>
+      <w:r>
+        <w:t xml:space="preserve">The 12-folder / ~196-canonical structure documented below is now the</w:t>
+      </w:r>
+      <w:r>
+        <w:t xml:space="preserve"> </w:t>
+      </w:r>
+      <w:r>
+        <w:rPr>
+          <w:i/>
+          <w:iCs/>
+        </w:rPr>
+        <w:t xml:space="preserve">historical</w:t>
+      </w:r>
+      <w:r>
+        <w:t xml:space="preserve"> </w:t>
+      </w:r>
+      <w:r>
+        <w:t xml:space="preserve">reference. The marketplace ships the</w:t>
+      </w:r>
+      <w:r>
+        <w:t xml:space="preserve"> </w:t>
+      </w:r>
+      <w:r>
+        <w:rPr>
+          <w:b/>
+          <w:bCs/>
+        </w:rPr>
+        <w:t xml:space="preserve">10-parent shrink</w:t>
+      </w:r>
+      <w:r>
+        <w:t xml:space="preserve"> </w:t>
+      </w:r>
+      <w:r>
+        <w:t xml:space="preserve">(Venue · Planning · Feast · Design · Program · Documentary · Look · Booths · Prints · Transport) — see</w:t>
+      </w:r>
+      <w:r>
+        <w:t xml:space="preserve"> </w:t>
+      </w:r>
+      <w:hyperlink r:id="rId9">
+        <w:r>
+          <w:rPr>
+            <w:rStyle w:val="Hyperlink"/>
+          </w:rPr>
+          <w:t xml:space="preserve">Vendor_Taxonomy_Shrink_2026-05-30.md</w:t>
+        </w:r>
+      </w:hyperlink>
+      <w:r>
+        <w:t xml:space="preserve"> </w:t>
+      </w:r>
+      <w:r>
+        <w:t xml:space="preserve">(live via PR #689) + the CLAUDE.md decision log 2026-05-31. The canonical</w:t>
+      </w:r>
+      <w:r>
+        <w:t xml:space="preserve"> </w:t>
+      </w:r>
+      <w:r>
+        <w:rPr>
+          <w:b/>
+          <w:bCs/>
+        </w:rPr>
+        <w:t xml:space="preserve">KEYS</w:t>
+      </w:r>
+      <w:r>
+        <w:t xml:space="preserve"> </w:t>
+      </w:r>
+      <w:r>
+        <w:t xml:space="preserve">below are unchanged (vendors keep their</w:t>
+      </w:r>
+      <w:r>
+        <w:t xml:space="preserve"> </w:t>
+      </w:r>
+      <w:r>
+        <w:rPr>
+          <w:rStyle w:val="VerbatimChar"/>
+        </w:rPr>
+        <w:t xml:space="preserve">services[]</w:t>
+      </w:r>
+      <w:r>
+        <w:t xml:space="preserve"> </w:t>
+      </w:r>
+      <w:r>
+        <w:t xml:space="preserve">tags) — only the parent grouping moved + 3 new canonicals were added (</w:t>
+      </w:r>
+      <w:r>
+        <w:rPr>
+          <w:rStyle w:val="VerbatimChar"/>
+        </w:rPr>
+        <w:t xml:space="preserve">orchestra</w:t>
+      </w:r>
+      <w:r>
+        <w:t xml:space="preserve">,</w:t>
+      </w:r>
+      <w:r>
+        <w:t xml:space="preserve"> </w:t>
+      </w:r>
+      <w:r>
+        <w:rPr>
+          <w:rStyle w:val="VerbatimChar"/>
+        </w:rPr>
+        <w:t xml:space="preserve">fireworks_pyro</w:t>
+      </w:r>
+      <w:r>
+        <w:t xml:space="preserve">,</w:t>
+      </w:r>
+      <w:r>
+        <w:t xml:space="preserve"> </w:t>
+      </w:r>
+      <w:r>
+        <w:rPr>
+          <w:rStyle w:val="VerbatimChar"/>
+        </w:rPr>
+        <w:t xml:space="preserve">led_video_wall</w:t>
+      </w:r>
+      <w:r>
+        <w:t xml:space="preserve">). This doc’s full rewrite to the 10-parent model is a deferred follow-up.</w:t>
+      </w:r>
+    </w:p>
+    <w:p>
+      <w:pPr>
+        <w:pStyle w:val="FirstParagraph"/>
+      </w:pPr>
+      <w:r>
+        <w:rPr>
+          <w:b/>
+          <w:bCs/>
+        </w:rPr>
         <w:t xml:space="preserve">Authoritative iteration specs (this doc consolidates, doesn’t replace):</w:t>
       </w:r>
       <w:r>
@@ -67,7 +198,7 @@
       <w:r>
         <w:t xml:space="preserve"> </w:t>
       </w:r>
-      <w:hyperlink r:id="rId9">
+      <w:hyperlink r:id="rId10">
         <w:r>
           <w:rPr>
             <w:rStyle w:val="Hyperlink"/>
@@ -90,7 +221,7 @@
       <w:r>
         <w:t xml:space="preserve"> </w:t>
       </w:r>
-      <w:hyperlink r:id="rId10">
+      <w:hyperlink r:id="rId11">
         <w:r>
           <w:rPr>
             <w:rStyle w:val="Hyperlink"/>
@@ -113,7 +244,7 @@
       <w:r>
         <w:t xml:space="preserve"> </w:t>
       </w:r>
-      <w:hyperlink r:id="rId11">
+      <w:hyperlink r:id="rId12">
         <w:r>
           <w:rPr>
             <w:rStyle w:val="Hyperlink"/>
@@ -136,7 +267,7 @@
       <w:r>
         <w:t xml:space="preserve"> </w:t>
       </w:r>
-      <w:hyperlink r:id="rId12">
+      <w:hyperlink r:id="rId13">
         <w:r>
           <w:rPr>
             <w:rStyle w:val="Hyperlink"/>
@@ -159,7 +290,7 @@
       <w:r>
         <w:t xml:space="preserve"> </w:t>
       </w:r>
-      <w:hyperlink r:id="rId13">
+      <w:hyperlink r:id="rId14">
         <w:r>
           <w:rPr>
             <w:rStyle w:val="Hyperlink"/>
@@ -182,7 +313,7 @@
       <w:r>
         <w:t xml:space="preserve"> </w:t>
       </w:r>
-      <w:hyperlink r:id="rId14">
+      <w:hyperlink r:id="rId15">
         <w:r>
           <w:rPr>
             <w:rStyle w:val="Hyperlink"/>
@@ -217,7 +348,7 @@
       <w:r>
         <w:t xml:space="preserve"> </w:t>
       </w:r>
-      <w:hyperlink r:id="rId10">
+      <w:hyperlink r:id="rId11">
         <w:r>
           <w:rPr>
             <w:rStyle w:val="Hyperlink"/>
@@ -248,7 +379,7 @@
         </w:pict>
       </w:r>
     </w:p>
-    <w:bookmarkStart w:id="16" w:name="X5a62e868a5cfa79faf1af7853a8fd2b5165006e"/>
+    <w:bookmarkStart w:id="17" w:name="X5a62e868a5cfa79faf1af7853a8fd2b5165006e"/>
     <w:p>
       <w:pPr>
         <w:pStyle w:val="Heading2"/>
@@ -277,7 +408,7 @@
       <w:r>
         <w:t xml:space="preserve"> </w:t>
       </w:r>
-      <w:hyperlink r:id="rId15">
+      <w:hyperlink r:id="rId16">
         <w:r>
           <w:rPr>
             <w:rStyle w:val="Hyperlink"/>
@@ -1336,7 +1467,7 @@
       <w:r>
         <w:t xml:space="preserve"> </w:t>
       </w:r>
-      <w:hyperlink r:id="rId15">
+      <w:hyperlink r:id="rId16">
         <w:r>
           <w:rPr>
             <w:rStyle w:val="Hyperlink"/>
@@ -1355,8 +1486,8 @@
         </w:pict>
       </w:r>
     </w:p>
-    <w:bookmarkEnd w:id="16"/>
-    <w:bookmarkStart w:id="23" w:name="full-taxonomy-with-phase-mapping"/>
+    <w:bookmarkEnd w:id="17"/>
+    <w:bookmarkStart w:id="24" w:name="full-taxonomy-with-phase-mapping"/>
     <w:p>
       <w:pPr>
         <w:pStyle w:val="Heading2"/>
@@ -1514,7 +1645,7 @@
       <w:r>
         <w:t xml:space="preserve"> </w:t>
       </w:r>
-      <w:hyperlink r:id="rId10">
+      <w:hyperlink r:id="rId11">
         <w:r>
           <w:rPr>
             <w:rStyle w:val="Hyperlink"/>
@@ -1709,7 +1840,7 @@
         <w:t xml:space="preserve">V1.5+</w:t>
       </w:r>
     </w:p>
-    <w:bookmarkStart w:id="17" w:name="column-1-capture-visual"/>
+    <w:bookmarkStart w:id="18" w:name="column-1-capture-visual"/>
     <w:p>
       <w:pPr>
         <w:pStyle w:val="Heading3"/>
@@ -2201,8 +2332,8 @@
         </w:pict>
       </w:r>
     </w:p>
-    <w:bookmarkEnd w:id="17"/>
-    <w:bookmarkStart w:id="18" w:name="column-2-music-entertainment"/>
+    <w:bookmarkEnd w:id="18"/>
+    <w:bookmarkStart w:id="19" w:name="column-2-music-entertainment"/>
     <w:p>
       <w:pPr>
         <w:pStyle w:val="Heading3"/>
@@ -2818,8 +2949,8 @@
         </w:pict>
       </w:r>
     </w:p>
-    <w:bookmarkEnd w:id="18"/>
-    <w:bookmarkStart w:id="19" w:name="column-3-food-beverage"/>
+    <w:bookmarkEnd w:id="19"/>
+    <w:bookmarkStart w:id="20" w:name="column-3-food-beverage"/>
     <w:p>
       <w:pPr>
         <w:pStyle w:val="Heading3"/>
@@ -4174,8 +4305,8 @@
         </w:pict>
       </w:r>
     </w:p>
-    <w:bookmarkEnd w:id="19"/>
-    <w:bookmarkStart w:id="20" w:name="column-4-look-attire-beauty-decor"/>
+    <w:bookmarkEnd w:id="20"/>
+    <w:bookmarkStart w:id="21" w:name="column-4-look-attire-beauty-decor"/>
     <w:p>
       <w:pPr>
         <w:pStyle w:val="Heading3"/>
@@ -5769,8 +5900,8 @@
         </w:pict>
       </w:r>
     </w:p>
-    <w:bookmarkEnd w:id="20"/>
-    <w:bookmarkStart w:id="22" w:name="Xe3bb65190cf47566f92505dc2c8ae246b4f0ffe"/>
+    <w:bookmarkEnd w:id="21"/>
+    <w:bookmarkStart w:id="23" w:name="Xe3bb65190cf47566f92505dc2c8ae246b4f0ffe"/>
     <w:p>
       <w:pPr>
         <w:pStyle w:val="Heading3"/>
@@ -7156,7 +7287,7 @@
       <w:r>
         <w:t xml:space="preserve"> </w:t>
       </w:r>
-      <w:hyperlink r:id="rId21">
+      <w:hyperlink r:id="rId22">
         <w:r>
           <w:rPr>
             <w:rStyle w:val="Hyperlink"/>
@@ -7584,9 +7715,9 @@
         </w:pict>
       </w:r>
     </w:p>
-    <w:bookmarkEnd w:id="22"/>
     <w:bookmarkEnd w:id="23"/>
-    <w:bookmarkStart w:id="26" w:name="grand-totals-phase-summary"/>
+    <w:bookmarkEnd w:id="24"/>
+    <w:bookmarkStart w:id="27" w:name="grand-totals-phase-summary"/>
     <w:p>
       <w:pPr>
         <w:pStyle w:val="Heading2"/>
@@ -7786,7 +7917,7 @@
         </w:tc>
       </w:tr>
     </w:tbl>
-    <w:bookmarkStart w:id="24" w:name="of-which"/>
+    <w:bookmarkStart w:id="25" w:name="of-which"/>
     <w:p>
       <w:pPr>
         <w:pStyle w:val="Heading3"/>
@@ -7964,8 +8095,8 @@
         <w:t xml:space="preserve">.</w:t>
       </w:r>
     </w:p>
-    <w:bookmarkEnd w:id="24"/>
-    <w:bookmarkStart w:id="25" w:name="phase-cumulative-tally"/>
+    <w:bookmarkEnd w:id="25"/>
+    <w:bookmarkStart w:id="26" w:name="phase-cumulative-tally"/>
     <w:p>
       <w:pPr>
         <w:pStyle w:val="Heading3"/>
@@ -8468,9 +8599,9 @@
         </w:pict>
       </w:r>
     </w:p>
-    <w:bookmarkEnd w:id="25"/>
     <w:bookmarkEnd w:id="26"/>
-    <w:bookmarkStart w:id="38" w:name="Xbee44df75022e785d7a419e40b2d0e08f472695"/>
+    <w:bookmarkEnd w:id="27"/>
+    <w:bookmarkStart w:id="39" w:name="Xbee44df75022e785d7a419e40b2d0e08f472695"/>
     <w:p>
       <w:pPr>
         <w:pStyle w:val="Heading2"/>
@@ -8489,7 +8620,7 @@
       <w:r>
         <w:t xml:space="preserve"> </w:t>
       </w:r>
-      <w:hyperlink r:id="rId14">
+      <w:hyperlink r:id="rId15">
         <w:r>
           <w:rPr>
             <w:rStyle w:val="Hyperlink"/>
@@ -8503,7 +8634,7 @@
       <w:r>
         <w:t xml:space="preserve"> </w:t>
       </w:r>
-      <w:hyperlink r:id="rId11">
+      <w:hyperlink r:id="rId12">
         <w:r>
           <w:rPr>
             <w:rStyle w:val="Hyperlink"/>
@@ -8520,7 +8651,7 @@
       <w:r>
         <w:t xml:space="preserve"> </w:t>
       </w:r>
-      <w:hyperlink r:id="rId12">
+      <w:hyperlink r:id="rId13">
         <w:r>
           <w:rPr>
             <w:rStyle w:val="Hyperlink"/>
@@ -8669,7 +8800,7 @@
             <w:pPr>
               <w:pStyle w:val="Compact"/>
             </w:pPr>
-            <w:hyperlink r:id="rId27">
+            <w:hyperlink r:id="rId28">
               <w:r>
                 <w:rPr>
                   <w:rStyle w:val="Hyperlink"/>
@@ -8725,7 +8856,7 @@
             <w:pPr>
               <w:pStyle w:val="Compact"/>
             </w:pPr>
-            <w:hyperlink r:id="rId28">
+            <w:hyperlink r:id="rId29">
               <w:r>
                 <w:rPr>
                   <w:rStyle w:val="Hyperlink"/>
@@ -8775,7 +8906,7 @@
             <w:pPr>
               <w:pStyle w:val="Compact"/>
             </w:pPr>
-            <w:hyperlink r:id="rId29">
+            <w:hyperlink r:id="rId30">
               <w:r>
                 <w:rPr>
                   <w:rStyle w:val="Hyperlink"/>
@@ -8819,7 +8950,7 @@
             <w:pPr>
               <w:pStyle w:val="Compact"/>
             </w:pPr>
-            <w:hyperlink r:id="rId30">
+            <w:hyperlink r:id="rId31">
               <w:r>
                 <w:rPr>
                   <w:rStyle w:val="Hyperlink"/>
@@ -8863,7 +8994,7 @@
             <w:pPr>
               <w:pStyle w:val="Compact"/>
             </w:pPr>
-            <w:hyperlink r:id="rId31">
+            <w:hyperlink r:id="rId32">
               <w:r>
                 <w:rPr>
                   <w:rStyle w:val="Hyperlink"/>
@@ -8946,7 +9077,7 @@
             <w:pPr>
               <w:pStyle w:val="Compact"/>
             </w:pPr>
-            <w:hyperlink r:id="rId32">
+            <w:hyperlink r:id="rId33">
               <w:r>
                 <w:rPr>
                   <w:rStyle w:val="Hyperlink"/>
@@ -9015,7 +9146,7 @@
         <w:t xml:space="preserve">surfacing as first-class marketplace listings.</w:t>
       </w:r>
     </w:p>
-    <w:bookmarkStart w:id="37" w:name="X76784fbccf50d0fa440897550a0443ffbe2ee71"/>
+    <w:bookmarkStart w:id="38" w:name="X76784fbccf50d0fa440897550a0443ffbe2ee71"/>
     <w:p>
       <w:pPr>
         <w:pStyle w:val="Heading3"/>
@@ -9112,7 +9243,7 @@
             <w:pPr>
               <w:pStyle w:val="Compact"/>
             </w:pPr>
-            <w:hyperlink r:id="rId33">
+            <w:hyperlink r:id="rId34">
               <w:r>
                 <w:rPr>
                   <w:rStyle w:val="Hyperlink"/>
@@ -9166,7 +9297,7 @@
             <w:pPr>
               <w:pStyle w:val="Compact"/>
             </w:pPr>
-            <w:hyperlink r:id="rId34">
+            <w:hyperlink r:id="rId35">
               <w:r>
                 <w:rPr>
                   <w:rStyle w:val="Hyperlink"/>
@@ -9220,7 +9351,7 @@
             <w:pPr>
               <w:pStyle w:val="Compact"/>
             </w:pPr>
-            <w:hyperlink r:id="rId34">
+            <w:hyperlink r:id="rId35">
               <w:r>
                 <w:rPr>
                   <w:rStyle w:val="Hyperlink"/>
@@ -9274,7 +9405,7 @@
             <w:pPr>
               <w:pStyle w:val="Compact"/>
             </w:pPr>
-            <w:hyperlink r:id="rId31">
+            <w:hyperlink r:id="rId32">
               <w:r>
                 <w:rPr>
                   <w:rStyle w:val="Hyperlink"/>
@@ -9328,7 +9459,7 @@
             <w:pPr>
               <w:pStyle w:val="Compact"/>
             </w:pPr>
-            <w:hyperlink r:id="rId29">
+            <w:hyperlink r:id="rId30">
               <w:r>
                 <w:rPr>
                   <w:rStyle w:val="Hyperlink"/>
@@ -9382,7 +9513,7 @@
             <w:pPr>
               <w:pStyle w:val="Compact"/>
             </w:pPr>
-            <w:hyperlink r:id="rId32">
+            <w:hyperlink r:id="rId33">
               <w:r>
                 <w:rPr>
                   <w:rStyle w:val="Hyperlink"/>
@@ -9436,7 +9567,7 @@
             <w:pPr>
               <w:pStyle w:val="Compact"/>
             </w:pPr>
-            <w:hyperlink r:id="rId35">
+            <w:hyperlink r:id="rId36">
               <w:r>
                 <w:rPr>
                   <w:rStyle w:val="Hyperlink"/>
@@ -9490,7 +9621,7 @@
             <w:pPr>
               <w:pStyle w:val="Compact"/>
             </w:pPr>
-            <w:hyperlink r:id="rId27">
+            <w:hyperlink r:id="rId28">
               <w:r>
                 <w:rPr>
                   <w:rStyle w:val="Hyperlink"/>
@@ -9544,7 +9675,7 @@
             <w:pPr>
               <w:pStyle w:val="Compact"/>
             </w:pPr>
-            <w:hyperlink r:id="rId28">
+            <w:hyperlink r:id="rId29">
               <w:r>
                 <w:rPr>
                   <w:rStyle w:val="Hyperlink"/>
@@ -9598,7 +9729,7 @@
             <w:pPr>
               <w:pStyle w:val="Compact"/>
             </w:pPr>
-            <w:hyperlink r:id="rId30">
+            <w:hyperlink r:id="rId31">
               <w:r>
                 <w:rPr>
                   <w:rStyle w:val="Hyperlink"/>
@@ -9652,7 +9783,7 @@
             <w:pPr>
               <w:pStyle w:val="Compact"/>
             </w:pPr>
-            <w:hyperlink r:id="rId28">
+            <w:hyperlink r:id="rId29">
               <w:r>
                 <w:rPr>
                   <w:rStyle w:val="Hyperlink"/>
@@ -9712,7 +9843,7 @@
             <w:pPr>
               <w:pStyle w:val="Compact"/>
             </w:pPr>
-            <w:hyperlink r:id="rId36">
+            <w:hyperlink r:id="rId37">
               <w:r>
                 <w:rPr>
                   <w:rStyle w:val="Hyperlink"/>
@@ -9815,7 +9946,7 @@
             <w:pPr>
               <w:pStyle w:val="Compact"/>
             </w:pPr>
-            <w:hyperlink r:id="rId13">
+            <w:hyperlink r:id="rId14">
               <w:r>
                 <w:rPr>
                   <w:rStyle w:val="Hyperlink"/>
@@ -9991,9 +10122,9 @@
         </w:pict>
       </w:r>
     </w:p>
-    <w:bookmarkEnd w:id="37"/>
     <w:bookmarkEnd w:id="38"/>
-    <w:bookmarkStart w:id="40" w:name="faith-activation-cross-cutting-timeline"/>
+    <w:bookmarkEnd w:id="39"/>
+    <w:bookmarkStart w:id="41" w:name="faith-activation-cross-cutting-timeline"/>
     <w:p>
       <w:pPr>
         <w:pStyle w:val="Heading2"/>
@@ -10027,7 +10158,7 @@
       <w:r>
         <w:t xml:space="preserve"> </w:t>
       </w:r>
-      <w:hyperlink r:id="rId10">
+      <w:hyperlink r:id="rId11">
         <w:r>
           <w:rPr>
             <w:rStyle w:val="Hyperlink"/>
@@ -10297,7 +10428,7 @@
         </w:tc>
       </w:tr>
     </w:tbl>
-    <w:bookmarkStart w:id="39" w:name="faith-specific-category-gating"/>
+    <w:bookmarkStart w:id="40" w:name="faith-specific-category-gating"/>
     <w:p>
       <w:pPr>
         <w:pStyle w:val="Heading3"/>
@@ -10456,9 +10587,9 @@
         </w:pict>
       </w:r>
     </w:p>
-    <w:bookmarkEnd w:id="39"/>
     <w:bookmarkEnd w:id="40"/>
-    <w:bookmarkStart w:id="41" w:name="Xbcd153700bf5830e1dce6a2e2476470bd09ec61"/>
+    <w:bookmarkEnd w:id="41"/>
+    <w:bookmarkStart w:id="42" w:name="Xbcd153700bf5830e1dce6a2e2476470bd09ec61"/>
     <w:p>
       <w:pPr>
         <w:pStyle w:val="Heading2"/>
@@ -11706,8 +11837,8 @@
         </w:pict>
       </w:r>
     </w:p>
-    <w:bookmarkEnd w:id="41"/>
-    <w:bookmarkStart w:id="46" w:name="vendor-recruitment-plan-per-phase"/>
+    <w:bookmarkEnd w:id="42"/>
+    <w:bookmarkStart w:id="47" w:name="vendor-recruitment-plan-per-phase"/>
     <w:p>
       <w:pPr>
         <w:pStyle w:val="Heading2"/>
@@ -11716,7 +11847,7 @@
         <w:t xml:space="preserve">7. Vendor recruitment plan per phase</w:t>
       </w:r>
     </w:p>
-    <w:bookmarkStart w:id="42" w:name="X64875001ae23a295a818d36285555c43fb4d086"/>
+    <w:bookmarkStart w:id="43" w:name="X64875001ae23a295a818d36285555c43fb4d086"/>
     <w:p>
       <w:pPr>
         <w:pStyle w:val="Heading3"/>
@@ -11762,8 +11893,8 @@
         <w:t xml:space="preserve">. Time-box at ~20 vendors/week sustained → ~22 weeks total recruitment (~5.5 months). Start NOW; ahead of V1.1 launch.</w:t>
       </w:r>
     </w:p>
-    <w:bookmarkEnd w:id="42"/>
-    <w:bookmarkStart w:id="43" w:name="X36dc80aafee5acef3fb29394453e9a7fc5cca07"/>
+    <w:bookmarkEnd w:id="43"/>
+    <w:bookmarkStart w:id="44" w:name="X36dc80aafee5acef3fb29394453e9a7fc5cca07"/>
     <w:p>
       <w:pPr>
         <w:pStyle w:val="Heading3"/>
@@ -11798,7 +11929,7 @@
       <w:r>
         <w:t xml:space="preserve"> </w:t>
       </w:r>
-      <w:hyperlink r:id="rId9">
+      <w:hyperlink r:id="rId10">
         <w:r>
           <w:rPr>
             <w:rStyle w:val="Hyperlink"/>
@@ -11813,8 +11944,8 @@
         <w:t xml:space="preserve">handle thinner sub-regions gracefully.</w:t>
       </w:r>
     </w:p>
-    <w:bookmarkEnd w:id="43"/>
-    <w:bookmarkStart w:id="44" w:name="v1.2-expansion-recruitment"/>
+    <w:bookmarkEnd w:id="44"/>
+    <w:bookmarkStart w:id="45" w:name="v1.2-expansion-recruitment"/>
     <w:p>
       <w:pPr>
         <w:pStyle w:val="Heading3"/>
@@ -11831,8 +11962,8 @@
         <w:t xml:space="preserve">Niche categories (Wedding-Day Weather Forecaster, Bug Repellent Stations, Filipiniana Designer) likely 1-2 vendors per region at launch. Density grows organically post-launch.</w:t>
       </w:r>
     </w:p>
-    <w:bookmarkEnd w:id="44"/>
-    <w:bookmarkStart w:id="45" w:name="X2a79e78eb785584ff4905ce7e3087784db0509e"/>
+    <w:bookmarkEnd w:id="45"/>
+    <w:bookmarkStart w:id="46" w:name="X2a79e78eb785584ff4905ce7e3087784db0509e"/>
     <w:p>
       <w:pPr>
         <w:pStyle w:val="Heading3"/>
@@ -11851,7 +11982,7 @@
       <w:r>
         <w:t xml:space="preserve"> </w:t>
       </w:r>
-      <w:hyperlink r:id="rId10">
+      <w:hyperlink r:id="rId11">
         <w:r>
           <w:rPr>
             <w:rStyle w:val="Hyperlink"/>
@@ -11946,9 +12077,9 @@
         </w:pict>
       </w:r>
     </w:p>
-    <w:bookmarkEnd w:id="45"/>
     <w:bookmarkEnd w:id="46"/>
-    <w:bookmarkStart w:id="47" w:name="critical-sequencing-decisions-locked"/>
+    <w:bookmarkEnd w:id="47"/>
+    <w:bookmarkStart w:id="48" w:name="critical-sequencing-decisions-locked"/>
     <w:p>
       <w:pPr>
         <w:pStyle w:val="Heading2"/>
@@ -11980,7 +12111,7 @@
       <w:r>
         <w:t xml:space="preserve"> </w:t>
       </w:r>
-      <w:hyperlink r:id="rId34">
+      <w:hyperlink r:id="rId35">
         <w:r>
           <w:rPr>
             <w:rStyle w:val="Hyperlink"/>
@@ -12176,8 +12307,8 @@
         </w:pict>
       </w:r>
     </w:p>
-    <w:bookmarkEnd w:id="47"/>
-    <w:bookmarkStart w:id="50" w:name="cross-references"/>
+    <w:bookmarkEnd w:id="48"/>
+    <w:bookmarkStart w:id="51" w:name="cross-references"/>
     <w:p>
       <w:pPr>
         <w:pStyle w:val="Heading2"/>
@@ -12257,7 +12388,7 @@
             <w:pPr>
               <w:pStyle w:val="Compact"/>
             </w:pPr>
-            <w:hyperlink r:id="rId9">
+            <w:hyperlink r:id="rId10">
               <w:r>
                 <w:rPr>
                   <w:rStyle w:val="Hyperlink"/>
@@ -12286,7 +12417,7 @@
             <w:pPr>
               <w:pStyle w:val="Compact"/>
             </w:pPr>
-            <w:hyperlink r:id="rId10">
+            <w:hyperlink r:id="rId11">
               <w:r>
                 <w:rPr>
                   <w:rStyle w:val="Hyperlink"/>
@@ -12315,7 +12446,7 @@
             <w:pPr>
               <w:pStyle w:val="Compact"/>
             </w:pPr>
-            <w:hyperlink r:id="rId11">
+            <w:hyperlink r:id="rId12">
               <w:r>
                 <w:rPr>
                   <w:rStyle w:val="Hyperlink"/>
@@ -12344,7 +12475,7 @@
             <w:pPr>
               <w:pStyle w:val="Compact"/>
             </w:pPr>
-            <w:hyperlink r:id="rId12">
+            <w:hyperlink r:id="rId13">
               <w:r>
                 <w:rPr>
                   <w:rStyle w:val="Hyperlink"/>
@@ -12373,7 +12504,7 @@
             <w:pPr>
               <w:pStyle w:val="Compact"/>
             </w:pPr>
-            <w:hyperlink r:id="rId13">
+            <w:hyperlink r:id="rId14">
               <w:r>
                 <w:rPr>
                   <w:rStyle w:val="Hyperlink"/>
@@ -12402,7 +12533,7 @@
             <w:pPr>
               <w:pStyle w:val="Compact"/>
             </w:pPr>
-            <w:hyperlink r:id="rId14">
+            <w:hyperlink r:id="rId15">
               <w:r>
                 <w:rPr>
                   <w:rStyle w:val="Hyperlink"/>
@@ -12431,7 +12562,7 @@
             <w:pPr>
               <w:pStyle w:val="Compact"/>
             </w:pPr>
-            <w:hyperlink r:id="rId48">
+            <w:hyperlink r:id="rId49">
               <w:r>
                 <w:rPr>
                   <w:rStyle w:val="Hyperlink"/>
@@ -12460,7 +12591,7 @@
             <w:pPr>
               <w:pStyle w:val="Compact"/>
             </w:pPr>
-            <w:hyperlink r:id="rId49">
+            <w:hyperlink r:id="rId50">
               <w:r>
                 <w:rPr>
                   <w:rStyle w:val="Hyperlink"/>
@@ -12489,7 +12620,7 @@
             <w:pPr>
               <w:pStyle w:val="Compact"/>
             </w:pPr>
-            <w:hyperlink r:id="rId9">
+            <w:hyperlink r:id="rId10">
               <w:r>
                 <w:rPr>
                   <w:rStyle w:val="Hyperlink"/>
@@ -12518,7 +12649,7 @@
             <w:pPr>
               <w:pStyle w:val="Compact"/>
             </w:pPr>
-            <w:hyperlink r:id="rId29">
+            <w:hyperlink r:id="rId30">
               <w:r>
                 <w:rPr>
                   <w:rStyle w:val="Hyperlink"/>
@@ -12532,7 +12663,7 @@
             <w:r>
               <w:t xml:space="preserve"> </w:t>
             </w:r>
-            <w:hyperlink r:id="rId28">
+            <w:hyperlink r:id="rId29">
               <w:r>
                 <w:rPr>
                   <w:rStyle w:val="Hyperlink"/>
@@ -12546,7 +12677,7 @@
             <w:r>
               <w:t xml:space="preserve"> </w:t>
             </w:r>
-            <w:hyperlink r:id="rId27">
+            <w:hyperlink r:id="rId28">
               <w:r>
                 <w:rPr>
                   <w:rStyle w:val="Hyperlink"/>
@@ -12560,7 +12691,7 @@
             <w:r>
               <w:t xml:space="preserve"> </w:t>
             </w:r>
-            <w:hyperlink r:id="rId30">
+            <w:hyperlink r:id="rId31">
               <w:r>
                 <w:rPr>
                   <w:rStyle w:val="Hyperlink"/>
@@ -12574,7 +12705,7 @@
             <w:r>
               <w:t xml:space="preserve"> </w:t>
             </w:r>
-            <w:hyperlink r:id="rId32">
+            <w:hyperlink r:id="rId33">
               <w:r>
                 <w:rPr>
                   <w:rStyle w:val="Hyperlink"/>
@@ -12588,7 +12719,7 @@
             <w:r>
               <w:t xml:space="preserve"> </w:t>
             </w:r>
-            <w:hyperlink r:id="rId31">
+            <w:hyperlink r:id="rId32">
               <w:r>
                 <w:rPr>
                   <w:rStyle w:val="Hyperlink"/>
@@ -12607,8 +12738,8 @@
         </w:pict>
       </w:r>
     </w:p>
-    <w:bookmarkEnd w:id="50"/>
-    <w:bookmarkStart w:id="56" w:name="X744c907de7f17aa0671df220bc41e256945f1f0"/>
+    <w:bookmarkEnd w:id="51"/>
+    <w:bookmarkStart w:id="57" w:name="X744c907de7f17aa0671df220bc41e256945f1f0"/>
     <w:p>
       <w:pPr>
         <w:pStyle w:val="Heading2"/>
@@ -12635,7 +12766,7 @@
         <w:t xml:space="preserve">Owner directive 2026-05-24 closing a multi-turn architectural conversation: vendor categories split into two distinct presentation patterns based on how the vendor’s offering is shopped, NOT based on what the vendor sells. Grid layout, search, filter, lock CTA, and compare flow are identical across all categories — what differs is the per-vendor TILE CONTENT (one hero photo vs multi-photo portfolio carousel).</w:t>
       </w:r>
     </w:p>
-    <w:bookmarkStart w:id="51" w:name="the-two-patterns"/>
+    <w:bookmarkStart w:id="52" w:name="the-two-patterns"/>
     <w:p>
       <w:pPr>
         <w:pStyle w:val="Heading3"/>
@@ -12731,7 +12862,7 @@
       <w:r>
         <w:t xml:space="preserve"> </w:t>
       </w:r>
-      <w:hyperlink r:id="rId12">
+      <w:hyperlink r:id="rId13">
         <w:r>
           <w:rPr>
             <w:rStyle w:val="Hyperlink"/>
@@ -12761,8 +12892,8 @@
         <w:t xml:space="preserve">— vendor sells one fixed offering (a physical space, a person, a single rig, a single setup). One photo per vendor in the grid; locking the vendor locks the whole thing.</w:t>
       </w:r>
     </w:p>
-    <w:bookmarkEnd w:id="51"/>
-    <w:bookmarkStart w:id="52" w:name="category-assignment"/>
+    <w:bookmarkEnd w:id="52"/>
+    <w:bookmarkStart w:id="53" w:name="category-assignment"/>
     <w:p>
       <w:pPr>
         <w:pStyle w:val="Heading3"/>
@@ -12866,8 +12997,8 @@
         </w:tc>
       </w:tr>
     </w:tbl>
-    <w:bookmarkEnd w:id="52"/>
-    <w:bookmarkStart w:id="53" w:name="Xb46c1582124937a4129d8136d8b40be712b9d6b"/>
+    <w:bookmarkEnd w:id="53"/>
+    <w:bookmarkStart w:id="54" w:name="Xb46c1582124937a4129d8136d8b40be712b9d6b"/>
     <w:p>
       <w:pPr>
         <w:pStyle w:val="Heading3"/>
@@ -13044,8 +13175,8 @@
         </w:tc>
       </w:tr>
     </w:tbl>
-    <w:bookmarkEnd w:id="53"/>
-    <w:bookmarkStart w:id="54" w:name="v1-vs-v1.1-split"/>
+    <w:bookmarkEnd w:id="54"/>
+    <w:bookmarkStart w:id="55" w:name="v1-vs-v1.1-split"/>
     <w:p>
       <w:pPr>
         <w:pStyle w:val="Heading3"/>
@@ -13157,8 +13288,8 @@
         <w:t xml:space="preserve">(or derived from category) in the V1.1 PR.</w:t>
       </w:r>
     </w:p>
-    <w:bookmarkEnd w:id="54"/>
-    <w:bookmarkStart w:id="55" w:name="cross-reference"/>
+    <w:bookmarkEnd w:id="55"/>
+    <w:bookmarkStart w:id="56" w:name="cross-reference"/>
     <w:p>
       <w:pPr>
         <w:pStyle w:val="Heading3"/>
@@ -13175,7 +13306,7 @@
           <w:numId w:val="1004"/>
         </w:numPr>
       </w:pPr>
-      <w:hyperlink r:id="rId12">
+      <w:hyperlink r:id="rId13">
         <w:r>
           <w:rPr>
             <w:rStyle w:val="Hyperlink"/>
@@ -13207,7 +13338,7 @@
           <w:numId w:val="1004"/>
         </w:numPr>
       </w:pPr>
-      <w:hyperlink r:id="rId9">
+      <w:hyperlink r:id="rId10">
         <w:r>
           <w:rPr>
             <w:rStyle w:val="Hyperlink"/>
@@ -13230,7 +13361,7 @@
           <w:numId w:val="1004"/>
         </w:numPr>
       </w:pPr>
-      <w:hyperlink r:id="rId15">
+      <w:hyperlink r:id="rId16">
         <w:r>
           <w:rPr>
             <w:rStyle w:val="Hyperlink"/>
@@ -13264,9 +13395,9 @@
         </w:pict>
       </w:r>
     </w:p>
-    <w:bookmarkEnd w:id="55"/>
     <w:bookmarkEnd w:id="56"/>
-    <w:bookmarkStart w:id="59" w:name="maintenance-log"/>
+    <w:bookmarkEnd w:id="57"/>
+    <w:bookmarkStart w:id="60" w:name="maintenance-log"/>
     <w:p>
       <w:pPr>
         <w:pStyle w:val="Heading2"/>
@@ -13381,7 +13512,7 @@
             <w:r>
               <w:t xml:space="preserve">Cross-reference note added: V1.2 introduces multi-moderator event access (</w:t>
             </w:r>
-            <w:hyperlink r:id="rId57">
+            <w:hyperlink r:id="rId58">
               <w:r>
                 <w:rPr>
                   <w:rStyle w:val="Hyperlink"/>
@@ -13392,7 +13523,7 @@
             <w:r>
               <w:t xml:space="preserve">) + multi-payer cart (</w:t>
             </w:r>
-            <w:hyperlink r:id="rId58">
+            <w:hyperlink r:id="rId59">
               <w:r>
                 <w:rPr>
                   <w:rStyle w:val="Hyperlink"/>
@@ -13513,8 +13644,8 @@
         <w:t xml:space="preserve">- New presentation-pattern category → append to the matching cell in § 10 + add maintenance log row</w:t>
       </w:r>
     </w:p>
-    <w:bookmarkEnd w:id="59"/>
     <w:bookmarkEnd w:id="60"/>
+    <w:bookmarkEnd w:id="61"/>
     <w:sectPr>
       <w:footnotePr>
         <w:numRestart w:val="eachSect"/>

</xml_diff>